<commit_message>
Little By Little V0.7 Enemies added
</commit_message>
<xml_diff>
--- a/Game Design Document V2.docx
+++ b/Game Design Document V2.docx
@@ -384,347 +384,7 @@
           <w:sz w:val="16"/>
           <w:szCs w:val="16"/>
         </w:rPr>
-        <w:t xml:space="preserve">Dit examen is </w:t>
-      </w:r>
-      <w:proofErr w:type="spellStart"/>
-      <w:r>
-        <w:rPr>
-          <w:rFonts w:ascii="Arial" w:eastAsia="Arial" w:hAnsi="Arial" w:cs="Arial"/>
-          <w:b/>
-          <w:sz w:val="16"/>
-          <w:szCs w:val="16"/>
-        </w:rPr>
-        <w:t>ontwikkeld</w:t>
-      </w:r>
-      <w:proofErr w:type="spellEnd"/>
-      <w:r>
-        <w:rPr>
-          <w:rFonts w:ascii="Arial" w:eastAsia="Arial" w:hAnsi="Arial" w:cs="Arial"/>
-          <w:b/>
-          <w:sz w:val="16"/>
-          <w:szCs w:val="16"/>
-        </w:rPr>
-        <w:t xml:space="preserve"> door Bob van den Berge, coach </w:t>
-      </w:r>
-      <w:proofErr w:type="spellStart"/>
-      <w:r>
-        <w:rPr>
-          <w:rFonts w:ascii="Arial" w:eastAsia="Arial" w:hAnsi="Arial" w:cs="Arial"/>
-          <w:b/>
-          <w:sz w:val="16"/>
-          <w:szCs w:val="16"/>
-        </w:rPr>
-        <w:t>bij</w:t>
-      </w:r>
-      <w:proofErr w:type="spellEnd"/>
-      <w:r>
-        <w:rPr>
-          <w:rFonts w:ascii="Arial" w:eastAsia="Arial" w:hAnsi="Arial" w:cs="Arial"/>
-          <w:b/>
-          <w:sz w:val="16"/>
-          <w:szCs w:val="16"/>
-        </w:rPr>
-        <w:t xml:space="preserve"> de Bit Academy, en Joey Schmitz, docent Software Development </w:t>
-      </w:r>
-      <w:proofErr w:type="spellStart"/>
-      <w:r>
-        <w:rPr>
-          <w:rFonts w:ascii="Arial" w:eastAsia="Arial" w:hAnsi="Arial" w:cs="Arial"/>
-          <w:b/>
-          <w:sz w:val="16"/>
-          <w:szCs w:val="16"/>
-        </w:rPr>
-        <w:t>bij</w:t>
-      </w:r>
-      <w:proofErr w:type="spellEnd"/>
-      <w:r>
-        <w:rPr>
-          <w:rFonts w:ascii="Arial" w:eastAsia="Arial" w:hAnsi="Arial" w:cs="Arial"/>
-          <w:b/>
-          <w:sz w:val="16"/>
-          <w:szCs w:val="16"/>
-        </w:rPr>
-        <w:t xml:space="preserve"> ROC van Flevoland. </w:t>
-      </w:r>
-      <w:proofErr w:type="spellStart"/>
-      <w:r>
-        <w:rPr>
-          <w:rFonts w:ascii="Arial" w:eastAsia="Arial" w:hAnsi="Arial" w:cs="Arial"/>
-          <w:b/>
-          <w:sz w:val="16"/>
-          <w:szCs w:val="16"/>
-        </w:rPr>
-        <w:t>Onze</w:t>
-      </w:r>
-      <w:proofErr w:type="spellEnd"/>
-      <w:r>
-        <w:rPr>
-          <w:rFonts w:ascii="Arial" w:eastAsia="Arial" w:hAnsi="Arial" w:cs="Arial"/>
-          <w:b/>
-          <w:sz w:val="16"/>
-          <w:szCs w:val="16"/>
-        </w:rPr>
-        <w:t xml:space="preserve"> dank </w:t>
-      </w:r>
-      <w:proofErr w:type="spellStart"/>
-      <w:r>
-        <w:rPr>
-          <w:rFonts w:ascii="Arial" w:eastAsia="Arial" w:hAnsi="Arial" w:cs="Arial"/>
-          <w:b/>
-          <w:sz w:val="16"/>
-          <w:szCs w:val="16"/>
-        </w:rPr>
-        <w:t>gaat</w:t>
-      </w:r>
-      <w:proofErr w:type="spellEnd"/>
-      <w:r>
-        <w:rPr>
-          <w:rFonts w:ascii="Arial" w:eastAsia="Arial" w:hAnsi="Arial" w:cs="Arial"/>
-          <w:b/>
-          <w:sz w:val="16"/>
-          <w:szCs w:val="16"/>
-        </w:rPr>
-        <w:t xml:space="preserve"> </w:t>
-      </w:r>
-      <w:proofErr w:type="spellStart"/>
-      <w:r>
-        <w:rPr>
-          <w:rFonts w:ascii="Arial" w:eastAsia="Arial" w:hAnsi="Arial" w:cs="Arial"/>
-          <w:b/>
-          <w:sz w:val="16"/>
-          <w:szCs w:val="16"/>
-        </w:rPr>
-        <w:t>uit</w:t>
-      </w:r>
-      <w:proofErr w:type="spellEnd"/>
-      <w:r>
-        <w:rPr>
-          <w:rFonts w:ascii="Arial" w:eastAsia="Arial" w:hAnsi="Arial" w:cs="Arial"/>
-          <w:b/>
-          <w:sz w:val="16"/>
-          <w:szCs w:val="16"/>
-        </w:rPr>
-        <w:t xml:space="preserve"> </w:t>
-      </w:r>
-      <w:proofErr w:type="spellStart"/>
-      <w:r>
-        <w:rPr>
-          <w:rFonts w:ascii="Arial" w:eastAsia="Arial" w:hAnsi="Arial" w:cs="Arial"/>
-          <w:b/>
-          <w:sz w:val="16"/>
-          <w:szCs w:val="16"/>
-        </w:rPr>
-        <w:t>naar</w:t>
-      </w:r>
-      <w:proofErr w:type="spellEnd"/>
-      <w:r>
-        <w:rPr>
-          <w:rFonts w:ascii="Arial" w:eastAsia="Arial" w:hAnsi="Arial" w:cs="Arial"/>
-          <w:b/>
-          <w:sz w:val="16"/>
-          <w:szCs w:val="16"/>
-        </w:rPr>
-        <w:t xml:space="preserve"> Lincy </w:t>
-      </w:r>
-      <w:proofErr w:type="spellStart"/>
-      <w:r>
-        <w:rPr>
-          <w:rFonts w:ascii="Arial" w:eastAsia="Arial" w:hAnsi="Arial" w:cs="Arial"/>
-          <w:b/>
-          <w:sz w:val="16"/>
-          <w:szCs w:val="16"/>
-        </w:rPr>
-        <w:t>Ellermeijer</w:t>
-      </w:r>
-      <w:proofErr w:type="spellEnd"/>
-      <w:r>
-        <w:rPr>
-          <w:rFonts w:ascii="Arial" w:eastAsia="Arial" w:hAnsi="Arial" w:cs="Arial"/>
-          <w:b/>
-          <w:sz w:val="16"/>
-          <w:szCs w:val="16"/>
-        </w:rPr>
-        <w:t xml:space="preserve">, game developer en docent Game Development </w:t>
-      </w:r>
-      <w:proofErr w:type="spellStart"/>
-      <w:r>
-        <w:rPr>
-          <w:rFonts w:ascii="Arial" w:eastAsia="Arial" w:hAnsi="Arial" w:cs="Arial"/>
-          <w:b/>
-          <w:sz w:val="16"/>
-          <w:szCs w:val="16"/>
-        </w:rPr>
-        <w:t>bij</w:t>
-      </w:r>
-      <w:proofErr w:type="spellEnd"/>
-      <w:r>
-        <w:rPr>
-          <w:rFonts w:ascii="Arial" w:eastAsia="Arial" w:hAnsi="Arial" w:cs="Arial"/>
-          <w:b/>
-          <w:sz w:val="16"/>
-          <w:szCs w:val="16"/>
-        </w:rPr>
-        <w:t xml:space="preserve"> de HvA, </w:t>
-      </w:r>
-      <w:proofErr w:type="spellStart"/>
-      <w:r>
-        <w:rPr>
-          <w:rFonts w:ascii="Arial" w:eastAsia="Arial" w:hAnsi="Arial" w:cs="Arial"/>
-          <w:b/>
-          <w:sz w:val="16"/>
-          <w:szCs w:val="16"/>
-        </w:rPr>
-        <w:t>voor</w:t>
-      </w:r>
-      <w:proofErr w:type="spellEnd"/>
-      <w:r>
-        <w:rPr>
-          <w:rFonts w:ascii="Arial" w:eastAsia="Arial" w:hAnsi="Arial" w:cs="Arial"/>
-          <w:b/>
-          <w:sz w:val="16"/>
-          <w:szCs w:val="16"/>
-        </w:rPr>
-        <w:t xml:space="preserve"> </w:t>
-      </w:r>
-      <w:proofErr w:type="spellStart"/>
-      <w:r>
-        <w:rPr>
-          <w:rFonts w:ascii="Arial" w:eastAsia="Arial" w:hAnsi="Arial" w:cs="Arial"/>
-          <w:b/>
-          <w:sz w:val="16"/>
-          <w:szCs w:val="16"/>
-        </w:rPr>
-        <w:t>haar</w:t>
-      </w:r>
-      <w:proofErr w:type="spellEnd"/>
-      <w:r>
-        <w:rPr>
-          <w:rFonts w:ascii="Arial" w:eastAsia="Arial" w:hAnsi="Arial" w:cs="Arial"/>
-          <w:b/>
-          <w:sz w:val="16"/>
-          <w:szCs w:val="16"/>
-        </w:rPr>
-        <w:t xml:space="preserve"> </w:t>
-      </w:r>
-      <w:proofErr w:type="spellStart"/>
-      <w:r>
-        <w:rPr>
-          <w:rFonts w:ascii="Arial" w:eastAsia="Arial" w:hAnsi="Arial" w:cs="Arial"/>
-          <w:b/>
-          <w:sz w:val="16"/>
-          <w:szCs w:val="16"/>
-        </w:rPr>
-        <w:t>hulp</w:t>
-      </w:r>
-      <w:proofErr w:type="spellEnd"/>
-      <w:r>
-        <w:rPr>
-          <w:rFonts w:ascii="Arial" w:eastAsia="Arial" w:hAnsi="Arial" w:cs="Arial"/>
-          <w:b/>
-          <w:sz w:val="16"/>
-          <w:szCs w:val="16"/>
-        </w:rPr>
-        <w:t xml:space="preserve"> </w:t>
-      </w:r>
-      <w:proofErr w:type="spellStart"/>
-      <w:r>
-        <w:rPr>
-          <w:rFonts w:ascii="Arial" w:eastAsia="Arial" w:hAnsi="Arial" w:cs="Arial"/>
-          <w:b/>
-          <w:sz w:val="16"/>
-          <w:szCs w:val="16"/>
-        </w:rPr>
-        <w:t>bij</w:t>
-      </w:r>
-      <w:proofErr w:type="spellEnd"/>
-      <w:r>
-        <w:rPr>
-          <w:rFonts w:ascii="Arial" w:eastAsia="Arial" w:hAnsi="Arial" w:cs="Arial"/>
-          <w:b/>
-          <w:sz w:val="16"/>
-          <w:szCs w:val="16"/>
-        </w:rPr>
-        <w:t xml:space="preserve"> het </w:t>
-      </w:r>
-      <w:proofErr w:type="spellStart"/>
-      <w:r>
-        <w:rPr>
-          <w:rFonts w:ascii="Arial" w:eastAsia="Arial" w:hAnsi="Arial" w:cs="Arial"/>
-          <w:b/>
-          <w:sz w:val="16"/>
-          <w:szCs w:val="16"/>
-        </w:rPr>
-        <w:t>ontwikkelen</w:t>
-      </w:r>
-      <w:proofErr w:type="spellEnd"/>
-      <w:r>
-        <w:rPr>
-          <w:rFonts w:ascii="Arial" w:eastAsia="Arial" w:hAnsi="Arial" w:cs="Arial"/>
-          <w:b/>
-          <w:sz w:val="16"/>
-          <w:szCs w:val="16"/>
-        </w:rPr>
-        <w:t xml:space="preserve"> van het </w:t>
-      </w:r>
-      <w:proofErr w:type="spellStart"/>
-      <w:r>
-        <w:rPr>
-          <w:rFonts w:ascii="Arial" w:eastAsia="Arial" w:hAnsi="Arial" w:cs="Arial"/>
-          <w:b/>
-          <w:sz w:val="16"/>
-          <w:szCs w:val="16"/>
-        </w:rPr>
-        <w:t>theoretische</w:t>
-      </w:r>
-      <w:proofErr w:type="spellEnd"/>
-      <w:r>
-        <w:rPr>
-          <w:rFonts w:ascii="Arial" w:eastAsia="Arial" w:hAnsi="Arial" w:cs="Arial"/>
-          <w:b/>
-          <w:sz w:val="16"/>
-          <w:szCs w:val="16"/>
-        </w:rPr>
-        <w:t xml:space="preserve"> </w:t>
-      </w:r>
-      <w:proofErr w:type="spellStart"/>
-      <w:r>
-        <w:rPr>
-          <w:rFonts w:ascii="Arial" w:eastAsia="Arial" w:hAnsi="Arial" w:cs="Arial"/>
-          <w:b/>
-          <w:sz w:val="16"/>
-          <w:szCs w:val="16"/>
-        </w:rPr>
-        <w:t>deel</w:t>
-      </w:r>
-      <w:proofErr w:type="spellEnd"/>
-      <w:r>
-        <w:rPr>
-          <w:rFonts w:ascii="Arial" w:eastAsia="Arial" w:hAnsi="Arial" w:cs="Arial"/>
-          <w:b/>
-          <w:sz w:val="16"/>
-          <w:szCs w:val="16"/>
-        </w:rPr>
-        <w:t xml:space="preserve"> van de </w:t>
-      </w:r>
-      <w:proofErr w:type="spellStart"/>
-      <w:r>
-        <w:rPr>
-          <w:rFonts w:ascii="Arial" w:eastAsia="Arial" w:hAnsi="Arial" w:cs="Arial"/>
-          <w:b/>
-          <w:sz w:val="16"/>
-          <w:szCs w:val="16"/>
-        </w:rPr>
-        <w:t>lesstof</w:t>
-      </w:r>
-      <w:proofErr w:type="spellEnd"/>
-      <w:r>
-        <w:rPr>
-          <w:rFonts w:ascii="Arial" w:eastAsia="Arial" w:hAnsi="Arial" w:cs="Arial"/>
-          <w:b/>
-          <w:sz w:val="16"/>
-          <w:szCs w:val="16"/>
-        </w:rPr>
-        <w:t>.</w:t>
+        <w:t>Dit examen is ontwikkeld door Bob van den Berge, coach bij de Bit Academy, en Joey Schmitz, docent Software Development bij ROC van Flevoland. Onze dank gaat uit naar Lincy Ellermeijer, game developer en docent Game Development bij de HvA, voor haar hulp bij het ontwikkelen van het theoretische deel van de lesstof.</w:t>
       </w:r>
     </w:p>
     <w:p>
@@ -4995,7 +4655,7 @@
                       <w:sz w:val="22"/>
                       <w:szCs w:val="22"/>
                     </w:rPr>
-                    <w:t>The game will keep track of your stats</w:t>
+                    <w:t>You can win the game and lose it. And the startup should include the bootup screen. enemies</w:t>
                   </w:r>
                 </w:p>
               </w:tc>
@@ -5101,7 +4761,16 @@
                       <w:sz w:val="22"/>
                       <w:szCs w:val="22"/>
                     </w:rPr>
-                    <w:t>24</w:t>
+                    <w:t>2</w:t>
+                  </w:r>
+                  <w:r>
+                    <w:rPr>
+                      <w:rFonts w:ascii="Cabin" w:eastAsia="Cabin" w:hAnsi="Cabin" w:cs="Cabin"/>
+                      <w:i/>
+                      <w:sz w:val="22"/>
+                      <w:szCs w:val="22"/>
+                    </w:rPr>
+                    <w:t>5</w:t>
                   </w:r>
                 </w:p>
               </w:tc>
@@ -5232,7 +4901,7 @@
                       <w:sz w:val="22"/>
                       <w:szCs w:val="22"/>
                     </w:rPr>
-                    <w:t>when go to the next world it will get increasing harder.</w:t>
+                    <w:t>Score and live should be displayed and another level to make it harder the level. Npc should be added</w:t>
                   </w:r>
                 </w:p>
               </w:tc>
@@ -5338,7 +5007,16 @@
                       <w:sz w:val="22"/>
                       <w:szCs w:val="22"/>
                     </w:rPr>
-                    <w:t>26</w:t>
+                    <w:t>2</w:t>
+                  </w:r>
+                  <w:r>
+                    <w:rPr>
+                      <w:rFonts w:ascii="Cabin" w:eastAsia="Cabin" w:hAnsi="Cabin" w:cs="Cabin"/>
+                      <w:i/>
+                      <w:sz w:val="22"/>
+                      <w:szCs w:val="22"/>
+                    </w:rPr>
+                    <w:t>7</w:t>
                   </w:r>
                 </w:p>
               </w:tc>
@@ -5389,6 +5067,7 @@
                 <w:sz w:val="22"/>
                 <w:szCs w:val="22"/>
               </w:rPr>
+              <w:lastRenderedPageBreak/>
               <w:t>Backlog</w:t>
             </w:r>
           </w:p>
@@ -5469,18 +5148,7 @@
                       <w:sz w:val="22"/>
                       <w:szCs w:val="22"/>
                     </w:rPr>
-                    <w:t xml:space="preserve">make an </w:t>
-                  </w:r>
-                  <w:proofErr w:type="spellStart"/>
-                  <w:r>
-                    <w:rPr>
-                      <w:rFonts w:ascii="Cabin" w:eastAsia="Cabin" w:hAnsi="Cabin" w:cs="Cabin"/>
-                      <w:i/>
-                      <w:color w:val="B7B7B7"/>
-                      <w:sz w:val="22"/>
-                      <w:szCs w:val="22"/>
-                    </w:rPr>
-                    <w:t>news</w:t>
+                    <w:t>make an news</w:t>
                   </w:r>
                   <w:r>
                     <w:rPr>
@@ -5500,18 +5168,7 @@
                       <w:sz w:val="22"/>
                       <w:szCs w:val="22"/>
                     </w:rPr>
-                    <w:t>letter</w:t>
-                  </w:r>
-                  <w:proofErr w:type="spellEnd"/>
-                  <w:r>
-                    <w:rPr>
-                      <w:rFonts w:ascii="Cabin" w:eastAsia="Cabin" w:hAnsi="Cabin" w:cs="Cabin"/>
-                      <w:i/>
-                      <w:color w:val="B7B7B7"/>
-                      <w:sz w:val="22"/>
-                      <w:szCs w:val="22"/>
-                    </w:rPr>
-                    <w:t xml:space="preserve"> where the </w:t>
+                    <w:t xml:space="preserve">letter where the </w:t>
                   </w:r>
                   <w:r>
                     <w:rPr>
@@ -5558,7 +5215,6 @@
                       <w:sz w:val="22"/>
                       <w:szCs w:val="22"/>
                     </w:rPr>
-                    <w:lastRenderedPageBreak/>
                     <w:t>Make an Leaderboard on how fast you complete the level compared to others and that you can race each other in the levels to see who is faster or just the homework puzzles.</w:t>
                   </w:r>
                 </w:p>
@@ -5740,7 +5396,7 @@
           <w:szCs w:val="36"/>
         </w:rPr>
         <w:drawing>
-          <wp:inline distT="0" distB="0" distL="0" distR="0" wp14:anchorId="55904E7D" wp14:editId="7778B12E">
+          <wp:inline distT="0" distB="0" distL="0" distR="0" wp14:anchorId="55904E7D" wp14:editId="3F5C1BED">
             <wp:extent cx="5723255" cy="3221355"/>
             <wp:effectExtent l="0" t="0" r="0" b="0"/>
             <wp:docPr id="1838848322" name="Picture 3"/>

</xml_diff>